<commit_message>
Add accepted NeurIPS LP4FM poster to portfolio and resume
</commit_message>
<xml_diff>
--- a/public/Dico_Angelo_Resume.docx
+++ b/public/Dico_Angelo_Resume.docx
@@ -363,17 +363,35 @@
         <w:ind w:left="187" w:hanging="187"/>
       </w:pPr>
       <w:r>
-        <w:t>Direct development with Claude Code and Codex, combining natural-language specifications, iterative testing and workflow review.</w:t>
+        <w:t>Built ResearchGravity to capture research findings and retrieve prior work, exploring practical applications of retrieval and multi-agent workflows.</w:t>
       </w:r>
     </w:p>
     <w:p>
       <w:pPr>
-        <w:pStyle w:val="ListBullet"/>
-        <w:keepLines/>
-        <w:ind w:left="187" w:hanging="187"/>
+        <w:pStyle w:val="Heading1"/>
       </w:pPr>
       <w:r>
-        <w:t>Built ResearchGravity to capture research findings and retrieve prior work, exploring practical applications of retrieval and multi-agent workflows.</w:t>
+        <w:t>RESEARCH</w:t>
+      </w:r>
+    </w:p>
+    <w:p>
+      <w:pPr>
+        <w:keepNext/>
+      </w:pPr>
+      <w:hyperlink r:id="rId11">
+        <w:r>
+          <w:rPr>
+            <w:color w:val="294E3D"/>
+            <w:sz w:val="22"/>
+            <w:b/>
+          </w:rPr>
+          <w:t>Burstiness Was Measured Wrong, and Prompting Cannot Aim It</w:t>
+        </w:r>
+      </w:hyperlink>
+    </w:p>
+    <w:p>
+      <w:r>
+        <w:t>Co-author with Vittoria Lanzo · Accepted poster, NeurIPS 2026 Workshop LP4FM</w:t>
       </w:r>
     </w:p>
     <w:p>
@@ -441,7 +459,7 @@
         <w:t xml:space="preserve">Revenue systems  </w:t>
       </w:r>
       <w:r>
-        <w:t>Salesforce administration, CRM data governance, partner platforms, deal registration, vendor evaluation, renewal planning and usage reporting.</w:t>
+        <w:t>Salesforce, CRM governance, partner platforms, deal registration and vendors.</w:t>
       </w:r>
     </w:p>
     <w:p>
@@ -452,7 +470,7 @@
         <w:t xml:space="preserve">Delivery and adoption  </w:t>
       </w:r>
       <w:r>
-        <w:t>Requirements discovery, integration coordination, user acceptance testing, onboarding, documentation, training and stakeholder communication.</w:t>
+        <w:t>Requirements, integrations, testing, enablement and stakeholder coordination.</w:t>
       </w:r>
     </w:p>
     <w:p>
@@ -463,7 +481,7 @@
         <w:t xml:space="preserve">AI-assisted development  </w:t>
       </w:r>
       <w:r>
-        <w:t>Claude Code, Codex, workflow automation, retrieval-augmented generation, multi-agent workflows and Model Context Protocol.</w:t>
+        <w:t>Claude Code, Codex, automation, retrieval, multi-agent workflows and MCP.</w:t>
       </w:r>
     </w:p>
     <w:p>
@@ -498,7 +516,7 @@
       </w:r>
     </w:p>
     <w:sectPr>
-      <w:footerReference w:type="default" r:id="rId11"/>
+      <w:footerReference w:type="default" r:id="rId12"/>
       <w:pgSz w:w="12240" w:h="15840"/>
       <w:pgMar w:top="907" w:right="1008" w:bottom="835" w:left="1008" w:header="288" w:footer="317" w:gutter="0"/>
       <w:cols w:space="720"/>

</xml_diff>

<commit_message>
Replace resume with v2: specific EZRA scope with shared-decision framing
</commit_message>
<xml_diff>
--- a/public/Dico_Angelo_Resume.docx
+++ b/public/Dico_Angelo_Resume.docx
@@ -20,7 +20,7 @@
           <w:color w:val="294E3D"/>
           <w:sz w:val="23"/>
         </w:rPr>
-        <w:t>Revenue Technology | GTM Operations | AI-Assisted Automation</w:t>
+        <w:t>Revenue Technology | GTM Systems | AI-Assisted Automation</w:t>
       </w:r>
     </w:p>
     <w:p>
@@ -31,7 +31,7 @@
         <w:rPr>
           <w:sz w:val="20"/>
         </w:rPr>
-        <w:t>Toronto, ON  |  dico.angelo97@gmail.com  |  519-999-6099</w:t>
+        <w:t>Toronto, ON  |  Canadian citizen  |  dico.angelo97@gmail.com  |  519-999-6099</w:t>
       </w:r>
     </w:p>
     <w:p>
@@ -65,7 +65,7 @@
     </w:p>
     <w:p>
       <w:r>
-        <w:t>Revenue technology and GTM operations professional connecting business requirements, systems and adoption. Current Revenue Technology Manager at EZRA, with previous experience in global partner systems at Contentsquare and sales and product operations at Rocket Mortgage Canada. Combines platform administration, workflow improvement and cross-functional delivery with practical AI-assisted development.</w:t>
+        <w:t>Revenue technology manager who runs the systems behind revenue teams: platform administration, integrations, reporting, vendor governance and AI-assisted automation. Hands-on owner of GTM stack administration and integrations at EZRA (Adecco Group). Previously ran partner-systems operations at Contentsquare, processing 2,500+ deal registrations at 97% approval.</w:t>
       </w:r>
     </w:p>
     <w:p>
@@ -104,7 +104,7 @@
         <w:ind w:left="187" w:hanging="187"/>
       </w:pPr>
       <w:r>
-        <w:t>Manage revenue technology and AI-enabled workflows supporting go-to-market teams, working across RevOps, Marketing Ops, IT and vendors.</w:t>
+        <w:t>Built the system of record for the revenue stack: 15 costed vendor lines with verified term dates, notice periods and ownership. Surfaced renewal exposure on roughly 30% of tracked vendor spend that a forward-looking report had missed.</w:t>
       </w:r>
     </w:p>
     <w:p>
@@ -114,7 +114,7 @@
         <w:ind w:left="187" w:hanging="187"/>
       </w:pPr>
       <w:r>
-        <w:t>Coordinate platform administration, user access, integrations and workflow improvements, carrying requirements through technical and governance reviews.</w:t>
+        <w:t>Run the analysis behind vendor evaluations and renewals across Gong, Apollo, Qualified, WRITER, Gumloop and event technology, bringing requirements and recommendations to GTM Operations leadership for joint decisions.</w:t>
       </w:r>
     </w:p>
     <w:p>
@@ -124,7 +124,7 @@
         <w:ind w:left="187" w:hanging="187"/>
       </w:pPr>
       <w:r>
-        <w:t>Build adoption and enablement through onboarding, documentation, tool guidance and training; develop reporting on usage and opportunities to improve the stack.</w:t>
+        <w:t>Partner on AI tool deployments, including platform management for the WRITER rollout: access, champions group and enablement for Brand, Creative and Product Marketing. Co-published the Sales AI Playbook with Revenue Enablement.</w:t>
       </w:r>
     </w:p>
     <w:p>
@@ -134,7 +134,7 @@
         <w:ind w:left="187" w:hanging="187"/>
       </w:pPr>
       <w:r>
-        <w:t>Translate business needs into AI and automation initiatives, including sales-assistant prototypes, knowledge retrieval and integration pilots using AI-assisted development.</w:t>
+        <w:t>Building the Qualified AI SDR setup with regional marketing teams and GTM Operations leadership: lead routing, automated follow-up and Salesforce campaign write-back.</w:t>
       </w:r>
     </w:p>
     <w:p>
@@ -144,7 +144,17 @@
         <w:ind w:left="187" w:hanging="187"/>
       </w:pPr>
       <w:r>
-        <w:t>Evaluate tools and coordinate vendor workstreams, connecting product capabilities to practical requirements and rollout plans.</w:t>
+        <w:t>Building Writer-to-Gong and Gong-to-Apollo integrations and Gumloop briefing workflows for sales; run provisioning, permissions, connector access and offboarding across the stack.</w:t>
+      </w:r>
+    </w:p>
+    <w:p>
+      <w:pPr>
+        <w:pStyle w:val="ListBullet"/>
+        <w:keepLines/>
+        <w:ind w:left="187" w:hanging="187"/>
+      </w:pPr>
+      <w:r>
+        <w:t>Build reporting across Gong and Salesforce, including MEDDPICC coverage analysis that traced a reported closed-won gap to a denominator difference rather than a data defect.</w:t>
       </w:r>
     </w:p>
     <w:p>
@@ -188,7 +198,7 @@
         <w:ind w:left="187" w:hanging="187"/>
       </w:pPr>
       <w:r>
-        <w:t>Ran partner-systems operations across AWS, Microsoft, Salesforce, PartnerStack, Crossbeam, Reveal and Suger, connecting sellers, partner managers, legal and finance across three regions.</w:t>
+        <w:t>Ran partner-systems operations across AWS, Microsoft, Salesforce, PartnerStack, Crossbeam, Reveal and Suger on a three-person team, connecting a 400+ seller organization with partner managers, legal and finance across three regions.</w:t>
       </w:r>
     </w:p>
     <w:p>
@@ -198,7 +208,7 @@
         <w:ind w:left="187" w:hanging="187"/>
       </w:pPr>
       <w:r>
-        <w:t>Processed 2,500+ deal registrations at 97% approval, representing $800M+ in shared pipeline total contract value co-registered with AWS and Microsoft. Contributed the operations layer of a program that reached $30M+ in marketplace revenue over 30 months.</w:t>
+        <w:t>Processed 2,500+ deal registrations at 97% approval, representing $800M+ in shared pipeline TCV co-registered with AWS and Microsoft.</w:t>
       </w:r>
     </w:p>
     <w:p>
@@ -208,7 +218,7 @@
         <w:ind w:left="187" w:hanging="187"/>
       </w:pPr>
       <w:r>
-        <w:t>Integrated partner-program systems into the cloud-alliance side of OneCRM; improved deal-registration workflows from 8 minutes to 30 seconds using AI-assisted automation.</w:t>
+        <w:t>Improved deal-registration workflows from 8 minutes to 30 seconds using AI-assisted automation; integrated partner-program systems into the cloud-alliance side of OneCRM.</w:t>
       </w:r>
     </w:p>
     <w:p>
@@ -218,7 +228,7 @@
         <w:ind w:left="187" w:hanging="187"/>
       </w:pPr>
       <w:r>
-        <w:t>Administered CRM access and data governance for up to 400 enabled sellers; created enablement materials that sales leaders and partner managers cascaded to their teams.</w:t>
+        <w:t>Built Salesforce reports for pipeline, propensity scoring, stage gating and partner attribution for pipeline reviews and QBRs.</w:t>
       </w:r>
     </w:p>
     <w:p>
@@ -228,7 +238,7 @@
         <w:ind w:left="187" w:hanging="187"/>
       </w:pPr>
       <w:r>
-        <w:t>Built Salesforce reports and specialized KPI additions supporting pipeline reviews, partner attribution and operational decisions.</w:t>
+        <w:t>Led renewal planning for three partner systems with procurement and legal; co-managed AWS market-development funding submissions and reconciliation.</w:t>
       </w:r>
     </w:p>
     <w:p>
@@ -238,7 +248,7 @@
         <w:ind w:left="187" w:hanging="187"/>
       </w:pPr>
       <w:r>
-        <w:t>Led renewal planning for three partner systems, coordinating evaluation and recommendations with procurement and legal; co-managed AWS market-development funding submissions and reconciliation.</w:t>
+        <w:t>Supported the operations layer of a cloud marketplace program that grew from $0 to $30M+ in revenue over 30 months, with 14x AWS year-over-year growth (team result).</w:t>
       </w:r>
     </w:p>
     <w:p>
@@ -294,7 +304,7 @@
         <w:ind w:left="187" w:hanging="187"/>
       </w:pPr>
       <w:r>
-        <w:t>Supported sales, product and operations through Salesforce administration, reporting and process improvement in a mortgage-finance business.</w:t>
+        <w:t>Administered Salesforce workflows, reports and dashboards for sales, product and operations in a regulated mortgage-finance business.</w:t>
       </w:r>
     </w:p>
     <w:p>
@@ -304,7 +314,7 @@
         <w:ind w:left="187" w:hanging="187"/>
       </w:pPr>
       <w:r>
-        <w:t>Coordinated Salesforce-to-Outlook rollout, permission sets, user guidance and team onboarding; communicated production changes to sales and operations teams.</w:t>
+        <w:t>Worked across Product, Sales and Customer Service on sprint planning, user stories, stakeholder demos and feature-adoption tracking; supported process automation and quality-control workflows.</w:t>
       </w:r>
     </w:p>
     <w:p>
@@ -314,7 +324,7 @@
         <w:ind w:left="187" w:hanging="187"/>
       </w:pPr>
       <w:r>
-        <w:t>Produced funnel and escalation analysis, maintained deal-quality reporting, and built evaluation workflows supporting a 45-agent operation.</w:t>
+        <w:t>Coordinated the Salesforce-to-Outlook rollout, permission sets and onboarding; produced funnel, escalation and deal-quality reporting for a 45-agent operation.</w:t>
       </w:r>
     </w:p>
     <w:p>
@@ -353,7 +363,7 @@
         <w:ind w:left="187" w:hanging="187"/>
       </w:pPr>
       <w:r>
-        <w:t>Build knowledge-retrieval and workflow-automation tools using AI-assisted development, from requirements and system design through implementation and validation.</w:t>
+        <w:t>Build knowledge-retrieval and workflow-automation tools using AI-assisted development, from requirements and system design through implementation, testing and deployment.</w:t>
       </w:r>
     </w:p>
     <w:p>
@@ -363,7 +373,7 @@
         <w:ind w:left="187" w:hanging="187"/>
       </w:pPr>
       <w:r>
-        <w:t>Built ResearchGravity to capture research findings and retrieve prior work, exploring practical applications of retrieval and multi-agent workflows.</w:t>
+        <w:t>Built ResearchGravity to capture research findings and retrieve prior work across AI tools; shipped client websites with booking, payments and lead capture (Next.js, Supabase, Stripe).</w:t>
       </w:r>
     </w:p>
     <w:p>

</xml_diff>

<commit_message>
Resume v2: drop ownership wording per resume rules
</commit_message>
<xml_diff>
--- a/public/Dico_Angelo_Resume.docx
+++ b/public/Dico_Angelo_Resume.docx
@@ -65,7 +65,7 @@
     </w:p>
     <w:p>
       <w:r>
-        <w:t>Revenue technology manager who runs the systems behind revenue teams: platform administration, integrations, reporting, vendor governance and AI-assisted automation. Hands-on owner of GTM stack administration and integrations at EZRA (Adecco Group). Previously ran partner-systems operations at Contentsquare, processing 2,500+ deal registrations at 97% approval.</w:t>
+        <w:t>Revenue technology manager who runs the systems behind revenue teams: platform administration, integrations, reporting, vendor governance and AI-assisted automation. Handles GTM stack administration and integrations hands-on at EZRA (Adecco Group). Previously ran partner-systems operations at Contentsquare, processing 2,500+ deal registrations at 97% approval.</w:t>
       </w:r>
     </w:p>
     <w:p>
@@ -104,7 +104,7 @@
         <w:ind w:left="187" w:hanging="187"/>
       </w:pPr>
       <w:r>
-        <w:t>Built the system of record for the revenue stack: 15 costed vendor lines with verified term dates, notice periods and ownership. Surfaced renewal exposure on roughly 30% of tracked vendor spend that a forward-looking report had missed.</w:t>
+        <w:t>Built the system of record for the revenue stack: 15 costed vendor lines with verified term dates, notice periods and accountable contacts. Surfaced renewal exposure on roughly 30% of tracked vendor spend that a forward-looking report had missed.</w:t>
       </w:r>
     </w:p>
     <w:p>

</xml_diff>